<commit_message>
docs: atualiza manual do usuário pra v1.3.0
- Recovery sem popup (retoma automático com Rodando/Pausado)
- DECORRIDO persiste entre reaberturas, incluindo tempo offline
- Botões do Display sem opacidade reduzida
- Versão 1.2.0 → 1.3.0 em todos os locais

Co-Authored-By: Claude Opus 4.7 <noreply@anthropic.com>
</commit_message>
<xml_diff>
--- a/docs/Manual_Usuario.docx
+++ b/docs/Manual_Usuario.docx
@@ -15,7 +15,7 @@
         <w:pStyle w:val="Subtitle"/>
       </w:pPr>
       <w:r>
-        <w:t xml:space="preserve">Manual do Usuário — Versão 1.2.0</w:t>
+        <w:t xml:space="preserve">Manual do Usuário — Versão 1.3.0</w:t>
       </w:r>
     </w:p>
     <w:p>
@@ -176,7 +176,7 @@
       <w:pPr>
         <w:spacing w:after="120"/>
       </w:pPr>
-      <w:hyperlink w:history="1" r:id="rIdxdqphzbxynh8xxjw7mm73">
+      <w:hyperlink w:history="1" r:id="rIdamhy5iwfumq393pny9ckw">
         <w:r>
           <w:rPr>
             <w:rStyle w:val="Hyperlink"/>
@@ -206,19 +206,19 @@
         </w:numPr>
       </w:pPr>
       <w:r>
-        <w:t xml:space="preserve">Clique no arquivo que termina em .msi — algo como TimePoker-1.2.0.0.msi.</w:t>
-      </w:r>
-    </w:p>
-    <w:p>
-      <w:pPr>
-        <w:pStyle w:val="ListParagraph"/>
-        <w:numPr>
-          <w:ilvl w:val="0"/>
-          <w:numId w:val="3"/>
-        </w:numPr>
-      </w:pPr>
-      <w:r>
-        <w:t xml:space="preserve">Aguarde o download terminar (alguns segundos a um minuto, dependendo da internet).</w:t>
+        <w:t xml:space="preserve">Clique no arquivo que termina em .msi — algo como TimePoker-1.3.0.0.msi.</w:t>
+      </w:r>
+    </w:p>
+    <w:p>
+      <w:pPr>
+        <w:pStyle w:val="ListParagraph"/>
+        <w:numPr>
+          <w:ilvl w:val="0"/>
+          <w:numId w:val="3"/>
+        </w:numPr>
+      </w:pPr>
+      <w:r>
+        <w:t xml:space="preserve">Aguarde o download terminar.</w:t>
       </w:r>
     </w:p>
     <w:p>
@@ -306,7 +306,7 @@
         </w:numPr>
       </w:pPr>
       <w:r>
-        <w:t xml:space="preserve">Confirme a pasta de instalação (deixe o padrão), clique em Avançar.</w:t>
+        <w:t xml:space="preserve">Confirme a pasta de instalação, clique em Avançar.</w:t>
       </w:r>
     </w:p>
     <w:p>
@@ -486,7 +486,7 @@
         </w:numPr>
       </w:pPr>
       <w:r>
-        <w:t xml:space="preserve">Próximo ▶: pula para o nível seguinte (e o cronômetro reinicia com o tempo daquele nível).</w:t>
+        <w:t xml:space="preserve">Próximo ▶: pula para o nível seguinte (cronômetro reinicia com o tempo daquele nível).</w:t>
       </w:r>
     </w:p>
     <w:p>
@@ -1070,15 +1070,15 @@
         <w:pStyle w:val="Heading3"/>
       </w:pPr>
       <w:r>
-        <w:t xml:space="preserve">"Esqueci de pausar e parei o jogo, perdi o tempo?"</w:t>
-      </w:r>
-    </w:p>
-    <w:p>
-      <w:pPr>
-        <w:spacing w:after="120"/>
-      </w:pPr>
-      <w:r>
-        <w:t xml:space="preserve">Não. Reabra o TimePoker — ele detecta a sessão anterior e pergunta se quer restaurar. Diga Sim e o tempo volta como Pausado (por segurança), você só clica Iniciar quando quiser continuar.</w:t>
+        <w:t xml:space="preserve">"Fechei sem querer (X ou crash) no meio da partida, perdi o tempo?"</w:t>
+      </w:r>
+    </w:p>
+    <w:p>
+      <w:pPr>
+        <w:spacing w:after="120"/>
+      </w:pPr>
+      <w:r>
+        <w:t xml:space="preserve">Não. Reabra o TimePoker — ele retoma a partida automaticamente (sem popup) na mesma rodada e nível. Se estava Rodando, o tempo que o app ficou fechado é descontado do nível atual e somado ao DECORRIDO. A partida volta como Pausada — você só clica Iniciar quando quiser continuar.</w:t>
       </w:r>
     </w:p>
     <w:p>
@@ -1149,7 +1149,7 @@
       <w:pPr>
         <w:spacing w:after="120"/>
       </w:pPr>
-      <w:hyperlink w:history="1" r:id="rId584-ujvflqdrm8pg_h7ja">
+      <w:hyperlink w:history="1" r:id="rId5bbunta7kcymxoeuggwhl">
         <w:r>
           <w:rPr>
             <w:rStyle w:val="Hyperlink"/>

</xml_diff>